<commit_message>
se agregan documentos modificados y nuevos documentos
</commit_message>
<xml_diff>
--- a/public/docs/fase1/eleccion_equipo_scrum_ajuptel.docx
+++ b/public/docs/fase1/eleccion_equipo_scrum_ajuptel.docx
@@ -535,7 +535,25 @@
           <w:sz w:val="24"/>
           <w:szCs w:val="24"/>
         </w:rPr>
-        <w:t xml:space="preserve"> Caraballo, Nattier – C.I.: 16.225.080</w:t>
+        <w:t xml:space="preserve"> Caraballo, </w:t>
+      </w:r>
+      <w:proofErr w:type="spellStart"/>
+      <w:r>
+        <w:rPr>
+          <w:rFonts w:ascii="Arial" w:hAnsi="Arial" w:cs="Arial"/>
+          <w:sz w:val="24"/>
+          <w:szCs w:val="24"/>
+        </w:rPr>
+        <w:t>Nattier</w:t>
+      </w:r>
+      <w:proofErr w:type="spellEnd"/>
+      <w:r>
+        <w:rPr>
+          <w:rFonts w:ascii="Arial" w:hAnsi="Arial" w:cs="Arial"/>
+          <w:sz w:val="24"/>
+          <w:szCs w:val="24"/>
+        </w:rPr>
+        <w:t xml:space="preserve"> – C.I.: 16.225.080</w:t>
       </w:r>
     </w:p>
     <w:p>
@@ -548,13 +566,23 @@
           <w:szCs w:val="24"/>
         </w:rPr>
       </w:pPr>
+      <w:proofErr w:type="spellStart"/>
       <w:r>
         <w:rPr>
           <w:rFonts w:ascii="Arial" w:hAnsi="Arial" w:cs="Arial"/>
           <w:sz w:val="24"/>
           <w:szCs w:val="24"/>
         </w:rPr>
-        <w:t>Cindia López C.I.: 13.019.951</w:t>
+        <w:t>Cindia</w:t>
+      </w:r>
+      <w:proofErr w:type="spellEnd"/>
+      <w:r>
+        <w:rPr>
+          <w:rFonts w:ascii="Arial" w:hAnsi="Arial" w:cs="Arial"/>
+          <w:sz w:val="24"/>
+          <w:szCs w:val="24"/>
+        </w:rPr>
+        <w:t xml:space="preserve"> López C.I.: 13.019.951</w:t>
       </w:r>
     </w:p>
     <w:p>
@@ -642,8 +670,34 @@
           <w:sz w:val="24"/>
           <w:szCs w:val="24"/>
         </w:rPr>
-        <w:t>Prof. Dr. Luis Rivas Algueida</w:t>
+        <w:t xml:space="preserve">Prof. </w:t>
       </w:r>
+      <w:r>
+        <w:rPr>
+          <w:rFonts w:ascii="Arial" w:hAnsi="Arial" w:cs="Arial"/>
+          <w:sz w:val="24"/>
+          <w:szCs w:val="24"/>
+        </w:rPr>
+        <w:t>Ing</w:t>
+      </w:r>
+      <w:r>
+        <w:rPr>
+          <w:rFonts w:ascii="Arial" w:hAnsi="Arial" w:cs="Arial"/>
+          <w:sz w:val="24"/>
+          <w:szCs w:val="24"/>
+        </w:rPr>
+        <w:t xml:space="preserve">. Luis Rivas </w:t>
+      </w:r>
+      <w:proofErr w:type="spellStart"/>
+      <w:r>
+        <w:rPr>
+          <w:rFonts w:ascii="Arial" w:hAnsi="Arial" w:cs="Arial"/>
+          <w:sz w:val="24"/>
+          <w:szCs w:val="24"/>
+        </w:rPr>
+        <w:t>Algueida</w:t>
+      </w:r>
+      <w:proofErr w:type="spellEnd"/>
     </w:p>
     <w:p>
       <w:pPr>
@@ -1247,6 +1301,7 @@
                 <w:szCs w:val="24"/>
               </w:rPr>
             </w:pPr>
+            <w:proofErr w:type="spellStart"/>
             <w:r>
               <w:rPr>
                 <w:rStyle w:val="Textoennegrita"/>
@@ -1254,7 +1309,17 @@
                 <w:sz w:val="24"/>
                 <w:szCs w:val="24"/>
               </w:rPr>
-              <w:t>Nattier Caraballo</w:t>
+              <w:t>Nattier</w:t>
+            </w:r>
+            <w:proofErr w:type="spellEnd"/>
+            <w:r>
+              <w:rPr>
+                <w:rStyle w:val="Textoennegrita"/>
+                <w:rFonts w:ascii="Arial" w:hAnsi="Arial" w:cs="Arial"/>
+                <w:sz w:val="24"/>
+                <w:szCs w:val="24"/>
+              </w:rPr>
+              <w:t xml:space="preserve"> Caraballo</w:t>
             </w:r>
           </w:p>
         </w:tc>
@@ -1331,6 +1396,7 @@
                 <w:szCs w:val="24"/>
               </w:rPr>
             </w:pPr>
+            <w:proofErr w:type="spellStart"/>
             <w:r>
               <w:rPr>
                 <w:rStyle w:val="Textoennegrita"/>
@@ -1338,7 +1404,17 @@
                 <w:sz w:val="24"/>
                 <w:szCs w:val="24"/>
               </w:rPr>
-              <w:t>Cindia López</w:t>
+              <w:t>Cindia</w:t>
+            </w:r>
+            <w:proofErr w:type="spellEnd"/>
+            <w:r>
+              <w:rPr>
+                <w:rStyle w:val="Textoennegrita"/>
+                <w:rFonts w:ascii="Arial" w:hAnsi="Arial" w:cs="Arial"/>
+                <w:sz w:val="24"/>
+                <w:szCs w:val="24"/>
+              </w:rPr>
+              <w:t xml:space="preserve"> López</w:t>
             </w:r>
           </w:p>
         </w:tc>
@@ -1439,7 +1515,61 @@
                 <w:sz w:val="24"/>
                 <w:szCs w:val="24"/>
               </w:rPr>
-              <w:t xml:space="preserve">Desarrollador FullStack con dominio de tecnologías frontend y backend. Ha trabajado en la construcción de aplicaciones completas, integrando pruebas de software y asegurando la funcionalidad de los sistemas. Su perfil técnico lo convierte en un recurso versátil para proyectos de desarrollo web. </w:t>
+              <w:t xml:space="preserve">Desarrollador </w:t>
+            </w:r>
+            <w:proofErr w:type="spellStart"/>
+            <w:r>
+              <w:rPr>
+                <w:rFonts w:ascii="Arial" w:hAnsi="Arial" w:cs="Arial"/>
+                <w:sz w:val="24"/>
+                <w:szCs w:val="24"/>
+              </w:rPr>
+              <w:t>FullStack</w:t>
+            </w:r>
+            <w:proofErr w:type="spellEnd"/>
+            <w:r>
+              <w:rPr>
+                <w:rFonts w:ascii="Arial" w:hAnsi="Arial" w:cs="Arial"/>
+                <w:sz w:val="24"/>
+                <w:szCs w:val="24"/>
+              </w:rPr>
+              <w:t xml:space="preserve"> con dominio de tecnologías </w:t>
+            </w:r>
+            <w:proofErr w:type="spellStart"/>
+            <w:r>
+              <w:rPr>
+                <w:rFonts w:ascii="Arial" w:hAnsi="Arial" w:cs="Arial"/>
+                <w:sz w:val="24"/>
+                <w:szCs w:val="24"/>
+              </w:rPr>
+              <w:t>frontend</w:t>
+            </w:r>
+            <w:proofErr w:type="spellEnd"/>
+            <w:r>
+              <w:rPr>
+                <w:rFonts w:ascii="Arial" w:hAnsi="Arial" w:cs="Arial"/>
+                <w:sz w:val="24"/>
+                <w:szCs w:val="24"/>
+              </w:rPr>
+              <w:t xml:space="preserve"> y </w:t>
+            </w:r>
+            <w:proofErr w:type="spellStart"/>
+            <w:r>
+              <w:rPr>
+                <w:rFonts w:ascii="Arial" w:hAnsi="Arial" w:cs="Arial"/>
+                <w:sz w:val="24"/>
+                <w:szCs w:val="24"/>
+              </w:rPr>
+              <w:t>backend</w:t>
+            </w:r>
+            <w:proofErr w:type="spellEnd"/>
+            <w:r>
+              <w:rPr>
+                <w:rFonts w:ascii="Arial" w:hAnsi="Arial" w:cs="Arial"/>
+                <w:sz w:val="24"/>
+                <w:szCs w:val="24"/>
+              </w:rPr>
+              <w:t xml:space="preserve">. Ha trabajado en la construcción de aplicaciones completas, integrando pruebas de software y asegurando la funcionalidad de los sistemas. Su perfil técnico lo convierte en un recurso versátil para proyectos de desarrollo web. </w:t>
             </w:r>
           </w:p>
         </w:tc>
@@ -1849,7 +1979,7 @@
                 <w:szCs w:val="24"/>
                 <w:lang w:val="es-ES"/>
               </w:rPr>
-              <w:t>Desarrollo de Software a Medida (Aplicación Web Responsive + IA).</w:t>
+              <w:t>Desarrollo de Software a Medida - Transformación Digital (Web + IA), y funcionalidades móviles sin app nativa.</w:t>
             </w:r>
           </w:p>
         </w:tc>
@@ -1975,6 +2105,7 @@
                 <w:lang w:val="es-ES"/>
               </w:rPr>
             </w:pPr>
+            <w:proofErr w:type="spellStart"/>
             <w:r>
               <w:rPr>
                 <w:rFonts w:ascii="Arial" w:hAnsi="Arial" w:cs="Arial"/>
@@ -1982,8 +2113,29 @@
                 <w:szCs w:val="24"/>
                 <w:lang w:val="es-ES"/>
               </w:rPr>
-              <w:t>Product Owner</w:t>
-            </w:r>
+              <w:t>Product</w:t>
+            </w:r>
+            <w:proofErr w:type="spellEnd"/>
+            <w:r>
+              <w:rPr>
+                <w:rFonts w:ascii="Arial" w:hAnsi="Arial" w:cs="Arial"/>
+                <w:sz w:val="24"/>
+                <w:szCs w:val="24"/>
+                <w:lang w:val="es-ES"/>
+              </w:rPr>
+              <w:t xml:space="preserve"> </w:t>
+            </w:r>
+            <w:proofErr w:type="spellStart"/>
+            <w:r>
+              <w:rPr>
+                <w:rFonts w:ascii="Arial" w:hAnsi="Arial" w:cs="Arial"/>
+                <w:sz w:val="24"/>
+                <w:szCs w:val="24"/>
+                <w:lang w:val="es-ES"/>
+              </w:rPr>
+              <w:t>Owner</w:t>
+            </w:r>
+            <w:proofErr w:type="spellEnd"/>
             <w:r>
               <w:rPr>
                 <w:rFonts w:ascii="Arial" w:hAnsi="Arial" w:cs="Arial"/>
@@ -2065,7 +2217,47 @@
                 <w:szCs w:val="24"/>
                 <w:lang w:val="es-ES"/>
               </w:rPr>
-              <w:t xml:space="preserve"> quién posee las competencias más adecuadas para desempeñar el rol de Product Owner, considerando liderazgo, visión estratégica, comunicación y capacidad organizativa.</w:t>
+              <w:t xml:space="preserve"> quién posee las competencias más adecuadas para desempeñar el rol de </w:t>
+            </w:r>
+            <w:proofErr w:type="spellStart"/>
+            <w:r>
+              <w:rPr>
+                <w:rFonts w:ascii="Arial" w:hAnsi="Arial" w:cs="Arial"/>
+                <w:sz w:val="24"/>
+                <w:szCs w:val="24"/>
+                <w:lang w:val="es-ES"/>
+              </w:rPr>
+              <w:t>Product</w:t>
+            </w:r>
+            <w:proofErr w:type="spellEnd"/>
+            <w:r>
+              <w:rPr>
+                <w:rFonts w:ascii="Arial" w:hAnsi="Arial" w:cs="Arial"/>
+                <w:sz w:val="24"/>
+                <w:szCs w:val="24"/>
+                <w:lang w:val="es-ES"/>
+              </w:rPr>
+              <w:t xml:space="preserve"> </w:t>
+            </w:r>
+            <w:proofErr w:type="spellStart"/>
+            <w:r>
+              <w:rPr>
+                <w:rFonts w:ascii="Arial" w:hAnsi="Arial" w:cs="Arial"/>
+                <w:sz w:val="24"/>
+                <w:szCs w:val="24"/>
+                <w:lang w:val="es-ES"/>
+              </w:rPr>
+              <w:t>Owner</w:t>
+            </w:r>
+            <w:proofErr w:type="spellEnd"/>
+            <w:r>
+              <w:rPr>
+                <w:rFonts w:ascii="Arial" w:hAnsi="Arial" w:cs="Arial"/>
+                <w:sz w:val="24"/>
+                <w:szCs w:val="24"/>
+                <w:lang w:val="es-ES"/>
+              </w:rPr>
+              <w:t>, considerando liderazgo, visión estratégica, comunicación y capacidad organizativa.</w:t>
             </w:r>
           </w:p>
         </w:tc>
@@ -2367,8 +2559,19 @@
                 <w:szCs w:val="24"/>
                 <w:lang w:val="es-ES"/>
               </w:rPr>
-              <w:t>20 pts</w:t>
-            </w:r>
+              <w:t xml:space="preserve">20 </w:t>
+            </w:r>
+            <w:proofErr w:type="spellStart"/>
+            <w:r>
+              <w:rPr>
+                <w:rFonts w:ascii="Arial" w:hAnsi="Arial" w:cs="Arial"/>
+                <w:sz w:val="24"/>
+                <w:szCs w:val="24"/>
+                <w:lang w:val="es-ES"/>
+              </w:rPr>
+              <w:t>pts</w:t>
+            </w:r>
+            <w:proofErr w:type="spellEnd"/>
           </w:p>
         </w:tc>
       </w:tr>
@@ -5056,7 +5259,47 @@
                 <w:szCs w:val="24"/>
                 <w:lang w:val="es-MX" w:eastAsia="es-MX"/>
               </w:rPr>
-              <w:t xml:space="preserve"> para el rol de Product Owner, </w:t>
+              <w:t xml:space="preserve"> para el rol de </w:t>
+            </w:r>
+            <w:proofErr w:type="spellStart"/>
+            <w:r>
+              <w:rPr>
+                <w:rFonts w:ascii="Arial" w:eastAsia="Times New Roman" w:hAnsi="Arial" w:cs="Arial"/>
+                <w:sz w:val="24"/>
+                <w:szCs w:val="24"/>
+                <w:lang w:val="es-MX" w:eastAsia="es-MX"/>
+              </w:rPr>
+              <w:t>Product</w:t>
+            </w:r>
+            <w:proofErr w:type="spellEnd"/>
+            <w:r>
+              <w:rPr>
+                <w:rFonts w:ascii="Arial" w:eastAsia="Times New Roman" w:hAnsi="Arial" w:cs="Arial"/>
+                <w:sz w:val="24"/>
+                <w:szCs w:val="24"/>
+                <w:lang w:val="es-MX" w:eastAsia="es-MX"/>
+              </w:rPr>
+              <w:t xml:space="preserve"> </w:t>
+            </w:r>
+            <w:proofErr w:type="spellStart"/>
+            <w:r>
+              <w:rPr>
+                <w:rFonts w:ascii="Arial" w:eastAsia="Times New Roman" w:hAnsi="Arial" w:cs="Arial"/>
+                <w:sz w:val="24"/>
+                <w:szCs w:val="24"/>
+                <w:lang w:val="es-MX" w:eastAsia="es-MX"/>
+              </w:rPr>
+              <w:t>Owner</w:t>
+            </w:r>
+            <w:proofErr w:type="spellEnd"/>
+            <w:r>
+              <w:rPr>
+                <w:rFonts w:ascii="Arial" w:eastAsia="Times New Roman" w:hAnsi="Arial" w:cs="Arial"/>
+                <w:sz w:val="24"/>
+                <w:szCs w:val="24"/>
+                <w:lang w:val="es-MX" w:eastAsia="es-MX"/>
+              </w:rPr>
+              <w:t xml:space="preserve">, </w:t>
             </w:r>
             <w:r>
               <w:rPr>
@@ -5074,7 +5317,27 @@
                 <w:szCs w:val="24"/>
                 <w:lang w:val="es-MX" w:eastAsia="es-MX"/>
               </w:rPr>
-              <w:t xml:space="preserve"> Nattier Caraballo</w:t>
+              <w:t xml:space="preserve"> </w:t>
+            </w:r>
+            <w:proofErr w:type="spellStart"/>
+            <w:r>
+              <w:rPr>
+                <w:rFonts w:ascii="Arial" w:eastAsia="Times New Roman" w:hAnsi="Arial" w:cs="Arial"/>
+                <w:sz w:val="24"/>
+                <w:szCs w:val="24"/>
+                <w:lang w:val="es-MX" w:eastAsia="es-MX"/>
+              </w:rPr>
+              <w:t>Nattier</w:t>
+            </w:r>
+            <w:proofErr w:type="spellEnd"/>
+            <w:r>
+              <w:rPr>
+                <w:rFonts w:ascii="Arial" w:eastAsia="Times New Roman" w:hAnsi="Arial" w:cs="Arial"/>
+                <w:sz w:val="24"/>
+                <w:szCs w:val="24"/>
+                <w:lang w:val="es-MX" w:eastAsia="es-MX"/>
+              </w:rPr>
+              <w:t xml:space="preserve"> Caraballo</w:t>
             </w:r>
           </w:p>
         </w:tc>
@@ -5789,15 +6052,27 @@
                 <w:lang w:val="es-MX" w:eastAsia="es-MX"/>
               </w:rPr>
             </w:pPr>
-            <w:r>
-              <w:rPr>
-                <w:rFonts w:ascii="Arial" w:eastAsia="Times New Roman" w:hAnsi="Arial" w:cs="Arial"/>
-                <w:color w:val="000000"/>
-                <w:sz w:val="24"/>
-                <w:szCs w:val="24"/>
-                <w:lang w:val="es-MX" w:eastAsia="es-MX"/>
-              </w:rPr>
-              <w:t>Nattier Caraballo</w:t>
+            <w:proofErr w:type="spellStart"/>
+            <w:r>
+              <w:rPr>
+                <w:rFonts w:ascii="Arial" w:eastAsia="Times New Roman" w:hAnsi="Arial" w:cs="Arial"/>
+                <w:color w:val="000000"/>
+                <w:sz w:val="24"/>
+                <w:szCs w:val="24"/>
+                <w:lang w:val="es-MX" w:eastAsia="es-MX"/>
+              </w:rPr>
+              <w:t>Nattier</w:t>
+            </w:r>
+            <w:proofErr w:type="spellEnd"/>
+            <w:r>
+              <w:rPr>
+                <w:rFonts w:ascii="Arial" w:eastAsia="Times New Roman" w:hAnsi="Arial" w:cs="Arial"/>
+                <w:color w:val="000000"/>
+                <w:sz w:val="24"/>
+                <w:szCs w:val="24"/>
+                <w:lang w:val="es-MX" w:eastAsia="es-MX"/>
+              </w:rPr>
+              <w:t xml:space="preserve"> Caraballo</w:t>
             </w:r>
           </w:p>
         </w:tc>
@@ -6221,15 +6496,27 @@
                 <w:lang w:val="es-MX" w:eastAsia="es-MX"/>
               </w:rPr>
             </w:pPr>
-            <w:r>
-              <w:rPr>
-                <w:rFonts w:ascii="Arial" w:eastAsia="Times New Roman" w:hAnsi="Arial" w:cs="Arial"/>
-                <w:color w:val="000000"/>
-                <w:sz w:val="24"/>
-                <w:szCs w:val="24"/>
-                <w:lang w:val="es-MX" w:eastAsia="es-MX"/>
-              </w:rPr>
-              <w:t xml:space="preserve">Cindia </w:t>
+            <w:proofErr w:type="spellStart"/>
+            <w:r>
+              <w:rPr>
+                <w:rFonts w:ascii="Arial" w:eastAsia="Times New Roman" w:hAnsi="Arial" w:cs="Arial"/>
+                <w:color w:val="000000"/>
+                <w:sz w:val="24"/>
+                <w:szCs w:val="24"/>
+                <w:lang w:val="es-MX" w:eastAsia="es-MX"/>
+              </w:rPr>
+              <w:t>Cindia</w:t>
+            </w:r>
+            <w:proofErr w:type="spellEnd"/>
+            <w:r>
+              <w:rPr>
+                <w:rFonts w:ascii="Arial" w:eastAsia="Times New Roman" w:hAnsi="Arial" w:cs="Arial"/>
+                <w:color w:val="000000"/>
+                <w:sz w:val="24"/>
+                <w:szCs w:val="24"/>
+                <w:lang w:val="es-MX" w:eastAsia="es-MX"/>
+              </w:rPr>
+              <w:t xml:space="preserve"> </w:t>
             </w:r>
             <w:r>
               <w:rPr>
@@ -11531,7 +11818,7 @@
                 <w:szCs w:val="24"/>
                 <w:lang w:val="es-ES"/>
               </w:rPr>
-              <w:t>Desarrollo de Software a Medida (Aplicación Web Responsive + IA).</w:t>
+              <w:t>Desarrollo de Software a Medida - Transformación Digital (Web + IA), y funcionalidades móviles sin app nativa.</w:t>
             </w:r>
           </w:p>
         </w:tc>
@@ -12915,6 +13202,7 @@
                 <w:lang w:val="es-MX" w:eastAsia="es-MX"/>
               </w:rPr>
             </w:pPr>
+            <w:proofErr w:type="spellStart"/>
             <w:r>
               <w:rPr>
                 <w:rFonts w:ascii="Arial" w:eastAsia="Times New Roman" w:hAnsi="Arial" w:cs="Arial"/>
@@ -12925,27 +13213,10 @@
                 <w:szCs w:val="24"/>
                 <w:lang w:val="es-MX" w:eastAsia="es-MX"/>
               </w:rPr>
-              <w:t>Cindia López</w:t>
-            </w:r>
-          </w:p>
-        </w:tc>
-        <w:tc>
-          <w:tcPr>
-            <w:tcW w:w="0" w:type="auto"/>
-            <w:tcBorders>
-              <w:top w:val="single" w:sz="4" w:space="0" w:color="000000"/>
-              <w:left w:val="nil"/>
-              <w:bottom w:val="single" w:sz="4" w:space="0" w:color="000000"/>
-              <w:right w:val="single" w:sz="4" w:space="0" w:color="000000"/>
-            </w:tcBorders>
-            <w:shd w:val="clear" w:color="auto" w:fill="000F2E"/>
-            <w:vAlign w:val="center"/>
-            <w:hideMark/>
-          </w:tcPr>
-          <w:p>
-            <w:pPr>
-              <w:spacing w:after="0" w:line="240" w:lineRule="auto"/>
-              <w:jc w:val="center"/>
+              <w:t>Cindia</w:t>
+            </w:r>
+            <w:proofErr w:type="spellEnd"/>
+            <w:r>
               <w:rPr>
                 <w:rFonts w:ascii="Arial" w:eastAsia="Times New Roman" w:hAnsi="Arial" w:cs="Arial"/>
                 <w:b/>
@@ -12955,8 +13226,27 @@
                 <w:szCs w:val="24"/>
                 <w:lang w:val="es-MX" w:eastAsia="es-MX"/>
               </w:rPr>
-            </w:pPr>
-            <w:r>
+              <w:t xml:space="preserve"> López</w:t>
+            </w:r>
+          </w:p>
+        </w:tc>
+        <w:tc>
+          <w:tcPr>
+            <w:tcW w:w="0" w:type="auto"/>
+            <w:tcBorders>
+              <w:top w:val="single" w:sz="4" w:space="0" w:color="000000"/>
+              <w:left w:val="nil"/>
+              <w:bottom w:val="single" w:sz="4" w:space="0" w:color="000000"/>
+              <w:right w:val="single" w:sz="4" w:space="0" w:color="000000"/>
+            </w:tcBorders>
+            <w:shd w:val="clear" w:color="auto" w:fill="000F2E"/>
+            <w:vAlign w:val="center"/>
+            <w:hideMark/>
+          </w:tcPr>
+          <w:p>
+            <w:pPr>
+              <w:spacing w:after="0" w:line="240" w:lineRule="auto"/>
+              <w:jc w:val="center"/>
               <w:rPr>
                 <w:rFonts w:ascii="Arial" w:eastAsia="Times New Roman" w:hAnsi="Arial" w:cs="Arial"/>
                 <w:b/>
@@ -12966,7 +13256,32 @@
                 <w:szCs w:val="24"/>
                 <w:lang w:val="es-MX" w:eastAsia="es-MX"/>
               </w:rPr>
-              <w:t>Nattier Caraballo</w:t>
+            </w:pPr>
+            <w:proofErr w:type="spellStart"/>
+            <w:r>
+              <w:rPr>
+                <w:rFonts w:ascii="Arial" w:eastAsia="Times New Roman" w:hAnsi="Arial" w:cs="Arial"/>
+                <w:b/>
+                <w:bCs/>
+                <w:color w:val="FFFFFF"/>
+                <w:sz w:val="24"/>
+                <w:szCs w:val="24"/>
+                <w:lang w:val="es-MX" w:eastAsia="es-MX"/>
+              </w:rPr>
+              <w:t>Nattier</w:t>
+            </w:r>
+            <w:proofErr w:type="spellEnd"/>
+            <w:r>
+              <w:rPr>
+                <w:rFonts w:ascii="Arial" w:eastAsia="Times New Roman" w:hAnsi="Arial" w:cs="Arial"/>
+                <w:b/>
+                <w:bCs/>
+                <w:color w:val="FFFFFF"/>
+                <w:sz w:val="24"/>
+                <w:szCs w:val="24"/>
+                <w:lang w:val="es-MX" w:eastAsia="es-MX"/>
+              </w:rPr>
+              <w:t xml:space="preserve"> Caraballo</w:t>
             </w:r>
           </w:p>
         </w:tc>
@@ -14742,14 +15057,25 @@
               </w:rPr>
               <w:t xml:space="preserve"> se concluye que el integrante con el perfil más adecuado es </w:t>
             </w:r>
-            <w:r>
-              <w:rPr>
-                <w:rFonts w:ascii="Arial" w:eastAsia="Times New Roman" w:hAnsi="Arial" w:cs="Arial"/>
-                <w:sz w:val="24"/>
-                <w:szCs w:val="24"/>
-                <w:lang w:val="es-MX" w:eastAsia="es-MX"/>
-              </w:rPr>
-              <w:t>Cindia López</w:t>
+            <w:proofErr w:type="spellStart"/>
+            <w:r>
+              <w:rPr>
+                <w:rFonts w:ascii="Arial" w:eastAsia="Times New Roman" w:hAnsi="Arial" w:cs="Arial"/>
+                <w:sz w:val="24"/>
+                <w:szCs w:val="24"/>
+                <w:lang w:val="es-MX" w:eastAsia="es-MX"/>
+              </w:rPr>
+              <w:t>Cindia</w:t>
+            </w:r>
+            <w:proofErr w:type="spellEnd"/>
+            <w:r>
+              <w:rPr>
+                <w:rFonts w:ascii="Arial" w:eastAsia="Times New Roman" w:hAnsi="Arial" w:cs="Arial"/>
+                <w:sz w:val="24"/>
+                <w:szCs w:val="24"/>
+                <w:lang w:val="es-MX" w:eastAsia="es-MX"/>
+              </w:rPr>
+              <w:t xml:space="preserve"> López</w:t>
             </w:r>
             <w:r>
               <w:rPr>
@@ -20006,6 +20332,137 @@
             <w:tcW w:w="6847" w:type="dxa"/>
             <w:gridSpan w:val="2"/>
             <w:tcBorders>
+              <w:top w:val="single" w:sz="4" w:space="0" w:color="auto"/>
+              <w:left w:val="single" w:sz="4" w:space="0" w:color="auto"/>
+              <w:bottom w:val="single" w:sz="4" w:space="0" w:color="auto"/>
+              <w:right w:val="single" w:sz="4" w:space="0" w:color="auto"/>
+            </w:tcBorders>
+          </w:tcPr>
+          <w:p>
+            <w:pPr>
+              <w:spacing w:line="276" w:lineRule="auto"/>
+              <w:jc w:val="both"/>
+              <w:rPr>
+                <w:rFonts w:ascii="Arial" w:hAnsi="Arial" w:cs="Arial"/>
+                <w:sz w:val="24"/>
+                <w:szCs w:val="24"/>
+                <w:lang w:val="es-ES"/>
+              </w:rPr>
+            </w:pPr>
+            <w:r>
+              <w:rPr>
+                <w:rFonts w:ascii="Arial" w:hAnsi="Arial" w:cs="Arial"/>
+                <w:sz w:val="24"/>
+                <w:szCs w:val="24"/>
+                <w:lang w:eastAsia="en-US"/>
+              </w:rPr>
+              <w:t>Desarrollo de Software a Medida - Transformación Digital (Web + IA), y funcionalidades móviles sin app nativa.</w:t>
+            </w:r>
+          </w:p>
+        </w:tc>
+      </w:tr>
+      <w:tr>
+        <w:tc>
+          <w:tcPr>
+            <w:tcW w:w="2547" w:type="dxa"/>
+            <w:tcBorders>
+              <w:bottom w:val="single" w:sz="4" w:space="0" w:color="auto"/>
+            </w:tcBorders>
+          </w:tcPr>
+          <w:p>
+            <w:pPr>
+              <w:spacing w:line="276" w:lineRule="auto"/>
+              <w:rPr>
+                <w:rFonts w:ascii="Arial" w:hAnsi="Arial" w:cs="Arial"/>
+                <w:b/>
+                <w:bCs/>
+                <w:sz w:val="24"/>
+                <w:szCs w:val="24"/>
+                <w:lang w:val="es-ES"/>
+              </w:rPr>
+            </w:pPr>
+            <w:r>
+              <w:rPr>
+                <w:rFonts w:ascii="Arial" w:hAnsi="Arial" w:cs="Arial"/>
+                <w:b/>
+                <w:bCs/>
+                <w:sz w:val="24"/>
+                <w:szCs w:val="24"/>
+                <w:lang w:val="es-ES"/>
+              </w:rPr>
+              <w:t>Patrocinador</w:t>
+            </w:r>
+          </w:p>
+        </w:tc>
+        <w:tc>
+          <w:tcPr>
+            <w:tcW w:w="6847" w:type="dxa"/>
+            <w:gridSpan w:val="2"/>
+            <w:tcBorders>
+              <w:top w:val="single" w:sz="4" w:space="0" w:color="000000"/>
+              <w:left w:val="single" w:sz="4" w:space="0" w:color="000000"/>
+              <w:bottom w:val="single" w:sz="4" w:space="0" w:color="auto"/>
+              <w:right w:val="single" w:sz="4" w:space="0" w:color="000000"/>
+            </w:tcBorders>
+          </w:tcPr>
+          <w:p>
+            <w:pPr>
+              <w:spacing w:line="276" w:lineRule="auto"/>
+              <w:jc w:val="both"/>
+              <w:rPr>
+                <w:rFonts w:ascii="Arial" w:hAnsi="Arial" w:cs="Arial"/>
+                <w:sz w:val="24"/>
+                <w:szCs w:val="24"/>
+                <w:lang w:val="es-ES"/>
+              </w:rPr>
+            </w:pPr>
+            <w:r>
+              <w:rPr>
+                <w:rFonts w:ascii="Arial" w:hAnsi="Arial" w:cs="Arial"/>
+                <w:sz w:val="24"/>
+                <w:szCs w:val="24"/>
+                <w:lang w:val="es-ES"/>
+              </w:rPr>
+              <w:t>Sr. Medardo Guerrero - Presidente de AJUPTEL CARABOBO.</w:t>
+            </w:r>
+          </w:p>
+        </w:tc>
+      </w:tr>
+      <w:tr>
+        <w:tc>
+          <w:tcPr>
+            <w:tcW w:w="2547" w:type="dxa"/>
+          </w:tcPr>
+          <w:p>
+            <w:pPr>
+              <w:spacing w:line="276" w:lineRule="auto"/>
+              <w:rPr>
+                <w:rFonts w:ascii="Arial" w:hAnsi="Arial" w:cs="Arial"/>
+                <w:b/>
+                <w:bCs/>
+                <w:sz w:val="24"/>
+                <w:szCs w:val="24"/>
+                <w:lang w:val="es-ES"/>
+              </w:rPr>
+            </w:pPr>
+            <w:r>
+              <w:rPr>
+                <w:rFonts w:ascii="Arial" w:hAnsi="Arial" w:cs="Arial"/>
+                <w:b/>
+                <w:bCs/>
+                <w:sz w:val="24"/>
+                <w:szCs w:val="24"/>
+                <w:lang w:val="es-ES"/>
+              </w:rPr>
+              <w:t>Rol Scrum a Evaluar</w:t>
+            </w:r>
+          </w:p>
+        </w:tc>
+        <w:tc>
+          <w:tcPr>
+            <w:tcW w:w="6847" w:type="dxa"/>
+            <w:gridSpan w:val="2"/>
+            <w:tcBorders>
               <w:top w:val="single" w:sz="4" w:space="0" w:color="000000"/>
               <w:left w:val="single" w:sz="4" w:space="0" w:color="000000"/>
               <w:bottom w:val="single" w:sz="4" w:space="0" w:color="000000"/>
@@ -20030,7 +20487,7 @@
                 <w:szCs w:val="24"/>
                 <w:lang w:val="es-ES"/>
               </w:rPr>
-              <w:t>Desarrollo de Software a Medida (Aplicación Web Responsive + IA).</w:t>
+              <w:t>Equipo de Desarrollo Scrum</w:t>
             </w:r>
           </w:p>
         </w:tc>
@@ -20039,9 +20496,6 @@
         <w:tc>
           <w:tcPr>
             <w:tcW w:w="2547" w:type="dxa"/>
-            <w:tcBorders>
-              <w:bottom w:val="single" w:sz="4" w:space="0" w:color="auto"/>
-            </w:tcBorders>
           </w:tcPr>
           <w:p>
             <w:pPr>
@@ -20064,71 +20518,7 @@
                 <w:szCs w:val="24"/>
                 <w:lang w:val="es-ES"/>
               </w:rPr>
-              <w:t>Patrocinador</w:t>
-            </w:r>
-          </w:p>
-        </w:tc>
-        <w:tc>
-          <w:tcPr>
-            <w:tcW w:w="6847" w:type="dxa"/>
-            <w:gridSpan w:val="2"/>
-            <w:tcBorders>
-              <w:top w:val="single" w:sz="4" w:space="0" w:color="000000"/>
-              <w:left w:val="single" w:sz="4" w:space="0" w:color="000000"/>
-              <w:bottom w:val="single" w:sz="4" w:space="0" w:color="auto"/>
-              <w:right w:val="single" w:sz="4" w:space="0" w:color="000000"/>
-            </w:tcBorders>
-          </w:tcPr>
-          <w:p>
-            <w:pPr>
-              <w:spacing w:line="276" w:lineRule="auto"/>
-              <w:jc w:val="both"/>
-              <w:rPr>
-                <w:rFonts w:ascii="Arial" w:hAnsi="Arial" w:cs="Arial"/>
-                <w:sz w:val="24"/>
-                <w:szCs w:val="24"/>
-                <w:lang w:val="es-ES"/>
-              </w:rPr>
-            </w:pPr>
-            <w:r>
-              <w:rPr>
-                <w:rFonts w:ascii="Arial" w:hAnsi="Arial" w:cs="Arial"/>
-                <w:sz w:val="24"/>
-                <w:szCs w:val="24"/>
-                <w:lang w:val="es-ES"/>
-              </w:rPr>
-              <w:t>Sr. Medardo Guerrero - Presidente de AJUPTEL CARABOBO.</w:t>
-            </w:r>
-          </w:p>
-        </w:tc>
-      </w:tr>
-      <w:tr>
-        <w:tc>
-          <w:tcPr>
-            <w:tcW w:w="2547" w:type="dxa"/>
-          </w:tcPr>
-          <w:p>
-            <w:pPr>
-              <w:spacing w:line="276" w:lineRule="auto"/>
-              <w:rPr>
-                <w:rFonts w:ascii="Arial" w:hAnsi="Arial" w:cs="Arial"/>
-                <w:b/>
-                <w:bCs/>
-                <w:sz w:val="24"/>
-                <w:szCs w:val="24"/>
-                <w:lang w:val="es-ES"/>
-              </w:rPr>
-            </w:pPr>
-            <w:r>
-              <w:rPr>
-                <w:rFonts w:ascii="Arial" w:hAnsi="Arial" w:cs="Arial"/>
-                <w:b/>
-                <w:bCs/>
-                <w:sz w:val="24"/>
-                <w:szCs w:val="24"/>
-                <w:lang w:val="es-ES"/>
-              </w:rPr>
-              <w:t>Rol Scrum a Evaluar</w:t>
+              <w:t>Objetivo</w:t>
             </w:r>
           </w:p>
         </w:tc>
@@ -20161,7 +20551,7 @@
                 <w:szCs w:val="24"/>
                 <w:lang w:val="es-ES"/>
               </w:rPr>
-              <w:t>Equipo de Desarrollo Scrum</w:t>
+              <w:t>Evaluar las competencias técnicas y colaborativas de los integrantes del equipo para seleccionar a los miembros más adecuados para desempeñarse como desarrolladores dentro del marco Scrum.</w:t>
             </w:r>
           </w:p>
         </w:tc>
@@ -20192,7 +20582,7 @@
                 <w:szCs w:val="24"/>
                 <w:lang w:val="es-ES"/>
               </w:rPr>
-              <w:t>Objetivo</w:t>
+              <w:t>Encargados de la selección</w:t>
             </w:r>
           </w:p>
         </w:tc>
@@ -20225,7 +20615,7 @@
                 <w:szCs w:val="24"/>
                 <w:lang w:val="es-ES"/>
               </w:rPr>
-              <w:t>Evaluar las competencias técnicas y colaborativas de los integrantes del equipo para seleccionar a los miembros más adecuados para desempeñarse como desarrolladores dentro del marco Scrum.</w:t>
+              <w:t>Equipo Scrum, Patrocinador, director de tecnología. Junta directiva.</w:t>
             </w:r>
           </w:p>
         </w:tc>
@@ -20233,7 +20623,12 @@
       <w:tr>
         <w:tc>
           <w:tcPr>
-            <w:tcW w:w="2547" w:type="dxa"/>
+            <w:tcW w:w="9394" w:type="dxa"/>
+            <w:gridSpan w:val="3"/>
+            <w:tcBorders>
+              <w:right w:val="single" w:sz="4" w:space="0" w:color="000000"/>
+            </w:tcBorders>
+            <w:shd w:val="clear" w:color="auto" w:fill="000F2E"/>
           </w:tcPr>
           <w:p>
             <w:pPr>
@@ -20256,52 +20651,52 @@
                 <w:szCs w:val="24"/>
                 <w:lang w:val="es-ES"/>
               </w:rPr>
-              <w:t>Encargados de la selección</w:t>
-            </w:r>
-          </w:p>
-        </w:tc>
-        <w:tc>
-          <w:tcPr>
-            <w:tcW w:w="6847" w:type="dxa"/>
-            <w:gridSpan w:val="2"/>
+              <w:t>CRITERIOS DE EVALUACIÓN</w:t>
+            </w:r>
+          </w:p>
+        </w:tc>
+      </w:tr>
+      <w:tr>
+        <w:tc>
+          <w:tcPr>
+            <w:tcW w:w="2547" w:type="dxa"/>
+            <w:shd w:val="clear" w:color="auto" w:fill="000F2E"/>
+          </w:tcPr>
+          <w:p>
+            <w:pPr>
+              <w:spacing w:line="276" w:lineRule="auto"/>
+              <w:jc w:val="center"/>
+              <w:rPr>
+                <w:rFonts w:ascii="Arial" w:hAnsi="Arial" w:cs="Arial"/>
+                <w:b/>
+                <w:bCs/>
+                <w:sz w:val="24"/>
+                <w:szCs w:val="24"/>
+                <w:lang w:val="es-ES"/>
+              </w:rPr>
+            </w:pPr>
+            <w:r>
+              <w:rPr>
+                <w:rFonts w:ascii="Arial" w:hAnsi="Arial" w:cs="Arial"/>
+                <w:b/>
+                <w:bCs/>
+                <w:sz w:val="24"/>
+                <w:szCs w:val="24"/>
+                <w:lang w:val="es-ES"/>
+              </w:rPr>
+              <w:t>Criterio</w:t>
+            </w:r>
+          </w:p>
+        </w:tc>
+        <w:tc>
+          <w:tcPr>
+            <w:tcW w:w="5528" w:type="dxa"/>
             <w:tcBorders>
               <w:top w:val="single" w:sz="4" w:space="0" w:color="000000"/>
               <w:left w:val="single" w:sz="4" w:space="0" w:color="000000"/>
               <w:bottom w:val="single" w:sz="4" w:space="0" w:color="000000"/>
               <w:right w:val="single" w:sz="4" w:space="0" w:color="000000"/>
             </w:tcBorders>
-          </w:tcPr>
-          <w:p>
-            <w:pPr>
-              <w:spacing w:line="276" w:lineRule="auto"/>
-              <w:jc w:val="both"/>
-              <w:rPr>
-                <w:rFonts w:ascii="Arial" w:hAnsi="Arial" w:cs="Arial"/>
-                <w:sz w:val="24"/>
-                <w:szCs w:val="24"/>
-                <w:lang w:val="es-ES"/>
-              </w:rPr>
-            </w:pPr>
-            <w:r>
-              <w:rPr>
-                <w:rFonts w:ascii="Arial" w:hAnsi="Arial" w:cs="Arial"/>
-                <w:sz w:val="24"/>
-                <w:szCs w:val="24"/>
-                <w:lang w:val="es-ES"/>
-              </w:rPr>
-              <w:t>Equipo Scrum, Patrocinador, director de tecnología. Junta directiva.</w:t>
-            </w:r>
-          </w:p>
-        </w:tc>
-      </w:tr>
-      <w:tr>
-        <w:tc>
-          <w:tcPr>
-            <w:tcW w:w="9394" w:type="dxa"/>
-            <w:gridSpan w:val="3"/>
-            <w:tcBorders>
-              <w:right w:val="single" w:sz="4" w:space="0" w:color="000000"/>
-            </w:tcBorders>
             <w:shd w:val="clear" w:color="auto" w:fill="000F2E"/>
           </w:tcPr>
           <w:p>
@@ -20325,46 +20720,13 @@
                 <w:szCs w:val="24"/>
                 <w:lang w:val="es-ES"/>
               </w:rPr>
-              <w:t>CRITERIOS DE EVALUACIÓN</w:t>
-            </w:r>
-          </w:p>
-        </w:tc>
-      </w:tr>
-      <w:tr>
-        <w:tc>
-          <w:tcPr>
-            <w:tcW w:w="2547" w:type="dxa"/>
-            <w:shd w:val="clear" w:color="auto" w:fill="000F2E"/>
-          </w:tcPr>
-          <w:p>
-            <w:pPr>
-              <w:spacing w:line="276" w:lineRule="auto"/>
-              <w:jc w:val="center"/>
-              <w:rPr>
-                <w:rFonts w:ascii="Arial" w:hAnsi="Arial" w:cs="Arial"/>
-                <w:b/>
-                <w:bCs/>
-                <w:sz w:val="24"/>
-                <w:szCs w:val="24"/>
-                <w:lang w:val="es-ES"/>
-              </w:rPr>
-            </w:pPr>
-            <w:r>
-              <w:rPr>
-                <w:rFonts w:ascii="Arial" w:hAnsi="Arial" w:cs="Arial"/>
-                <w:b/>
-                <w:bCs/>
-                <w:sz w:val="24"/>
-                <w:szCs w:val="24"/>
-                <w:lang w:val="es-ES"/>
-              </w:rPr>
-              <w:t>Criterio</w:t>
-            </w:r>
-          </w:p>
-        </w:tc>
-        <w:tc>
-          <w:tcPr>
-            <w:tcW w:w="5528" w:type="dxa"/>
+              <w:t>Descripción</w:t>
+            </w:r>
+          </w:p>
+        </w:tc>
+        <w:tc>
+          <w:tcPr>
+            <w:tcW w:w="1319" w:type="dxa"/>
             <w:tcBorders>
               <w:top w:val="single" w:sz="4" w:space="0" w:color="000000"/>
               <w:left w:val="single" w:sz="4" w:space="0" w:color="000000"/>
@@ -20376,6 +20738,7 @@
           <w:p>
             <w:pPr>
               <w:spacing w:line="276" w:lineRule="auto"/>
+              <w:jc w:val="center"/>
               <w:rPr>
                 <w:rFonts w:ascii="Arial" w:hAnsi="Arial" w:cs="Arial"/>
                 <w:b/>
@@ -20394,29 +20757,53 @@
                 <w:szCs w:val="24"/>
                 <w:lang w:val="es-ES"/>
               </w:rPr>
-              <w:t>Descripción</w:t>
-            </w:r>
-          </w:p>
-        </w:tc>
-        <w:tc>
-          <w:tcPr>
-            <w:tcW w:w="1319" w:type="dxa"/>
+              <w:t>Puntaje</w:t>
+            </w:r>
+          </w:p>
+        </w:tc>
+      </w:tr>
+      <w:tr>
+        <w:tc>
+          <w:tcPr>
+            <w:tcW w:w="2547" w:type="dxa"/>
+          </w:tcPr>
+          <w:p>
+            <w:pPr>
+              <w:spacing w:line="276" w:lineRule="auto"/>
+              <w:rPr>
+                <w:rFonts w:ascii="Arial" w:hAnsi="Arial" w:cs="Arial"/>
+                <w:b/>
+                <w:bCs/>
+                <w:sz w:val="24"/>
+                <w:szCs w:val="24"/>
+                <w:lang w:val="es-ES"/>
+              </w:rPr>
+            </w:pPr>
+            <w:r>
+              <w:rPr>
+                <w:rFonts w:ascii="Arial" w:hAnsi="Arial" w:cs="Arial"/>
+                <w:sz w:val="24"/>
+                <w:szCs w:val="24"/>
+              </w:rPr>
+              <w:t>Programación y desarrollo</w:t>
+            </w:r>
+          </w:p>
+        </w:tc>
+        <w:tc>
+          <w:tcPr>
+            <w:tcW w:w="5528" w:type="dxa"/>
             <w:tcBorders>
               <w:top w:val="single" w:sz="4" w:space="0" w:color="000000"/>
               <w:left w:val="single" w:sz="4" w:space="0" w:color="000000"/>
               <w:bottom w:val="single" w:sz="4" w:space="0" w:color="000000"/>
               <w:right w:val="single" w:sz="4" w:space="0" w:color="000000"/>
             </w:tcBorders>
-            <w:shd w:val="clear" w:color="auto" w:fill="000F2E"/>
           </w:tcPr>
           <w:p>
             <w:pPr>
               <w:spacing w:line="276" w:lineRule="auto"/>
-              <w:jc w:val="center"/>
               <w:rPr>
                 <w:rFonts w:ascii="Arial" w:hAnsi="Arial" w:cs="Arial"/>
-                <w:b/>
-                <w:bCs/>
                 <w:sz w:val="24"/>
                 <w:szCs w:val="24"/>
                 <w:lang w:val="es-ES"/>
@@ -20425,47 +20812,17 @@
             <w:r>
               <w:rPr>
                 <w:rFonts w:ascii="Arial" w:hAnsi="Arial" w:cs="Arial"/>
-                <w:b/>
-                <w:bCs/>
                 <w:sz w:val="24"/>
                 <w:szCs w:val="24"/>
                 <w:lang w:val="es-ES"/>
               </w:rPr>
-              <w:t>Puntaje</w:t>
-            </w:r>
-          </w:p>
-        </w:tc>
-      </w:tr>
-      <w:tr>
-        <w:tc>
-          <w:tcPr>
-            <w:tcW w:w="2547" w:type="dxa"/>
-          </w:tcPr>
-          <w:p>
-            <w:pPr>
-              <w:spacing w:line="276" w:lineRule="auto"/>
-              <w:rPr>
-                <w:rFonts w:ascii="Arial" w:hAnsi="Arial" w:cs="Arial"/>
-                <w:b/>
-                <w:bCs/>
-                <w:sz w:val="24"/>
-                <w:szCs w:val="24"/>
-                <w:lang w:val="es-ES"/>
-              </w:rPr>
-            </w:pPr>
-            <w:r>
-              <w:rPr>
-                <w:rFonts w:ascii="Arial" w:hAnsi="Arial" w:cs="Arial"/>
-                <w:sz w:val="24"/>
-                <w:szCs w:val="24"/>
-              </w:rPr>
-              <w:t>Programación y desarrollo</w:t>
-            </w:r>
-          </w:p>
-        </w:tc>
-        <w:tc>
-          <w:tcPr>
-            <w:tcW w:w="5528" w:type="dxa"/>
+              <w:t>Dominio de tecnologías y construcción de software</w:t>
+            </w:r>
+          </w:p>
+        </w:tc>
+        <w:tc>
+          <w:tcPr>
+            <w:tcW w:w="1319" w:type="dxa"/>
             <w:tcBorders>
               <w:top w:val="single" w:sz="4" w:space="0" w:color="000000"/>
               <w:left w:val="single" w:sz="4" w:space="0" w:color="000000"/>
@@ -20476,6 +20833,7 @@
           <w:p>
             <w:pPr>
               <w:spacing w:line="276" w:lineRule="auto"/>
+              <w:jc w:val="center"/>
               <w:rPr>
                 <w:rFonts w:ascii="Arial" w:hAnsi="Arial" w:cs="Arial"/>
                 <w:sz w:val="24"/>
@@ -20490,13 +20848,38 @@
                 <w:szCs w:val="24"/>
                 <w:lang w:val="es-ES"/>
               </w:rPr>
-              <w:t>Dominio de tecnologías y construcción de software</w:t>
-            </w:r>
-          </w:p>
-        </w:tc>
-        <w:tc>
-          <w:tcPr>
-            <w:tcW w:w="1319" w:type="dxa"/>
+              <w:t>20 pts.</w:t>
+            </w:r>
+          </w:p>
+        </w:tc>
+      </w:tr>
+      <w:tr>
+        <w:tc>
+          <w:tcPr>
+            <w:tcW w:w="2547" w:type="dxa"/>
+          </w:tcPr>
+          <w:p>
+            <w:pPr>
+              <w:spacing w:line="276" w:lineRule="auto"/>
+              <w:rPr>
+                <w:rFonts w:ascii="Arial" w:hAnsi="Arial" w:cs="Arial"/>
+                <w:sz w:val="24"/>
+                <w:szCs w:val="24"/>
+              </w:rPr>
+            </w:pPr>
+            <w:r>
+              <w:rPr>
+                <w:rFonts w:ascii="Arial" w:hAnsi="Arial" w:cs="Arial"/>
+                <w:sz w:val="24"/>
+                <w:szCs w:val="24"/>
+              </w:rPr>
+              <w:t>Trabajo en equipo</w:t>
+            </w:r>
+          </w:p>
+        </w:tc>
+        <w:tc>
+          <w:tcPr>
+            <w:tcW w:w="5528" w:type="dxa"/>
             <w:tcBorders>
               <w:top w:val="single" w:sz="4" w:space="0" w:color="000000"/>
               <w:left w:val="single" w:sz="4" w:space="0" w:color="000000"/>
@@ -20507,7 +20890,6 @@
           <w:p>
             <w:pPr>
               <w:spacing w:line="276" w:lineRule="auto"/>
-              <w:jc w:val="center"/>
               <w:rPr>
                 <w:rFonts w:ascii="Arial" w:hAnsi="Arial" w:cs="Arial"/>
                 <w:sz w:val="24"/>
@@ -20522,47 +20904,13 @@
                 <w:szCs w:val="24"/>
                 <w:lang w:val="es-ES"/>
               </w:rPr>
-              <w:t xml:space="preserve">20 </w:t>
-            </w:r>
-            <w:r>
-              <w:rPr>
-                <w:rFonts w:ascii="Arial" w:hAnsi="Arial" w:cs="Arial"/>
-                <w:sz w:val="24"/>
-                <w:szCs w:val="24"/>
-                <w:lang w:val="es-ES"/>
-              </w:rPr>
-              <w:t>pts.</w:t>
-            </w:r>
-          </w:p>
-        </w:tc>
-      </w:tr>
-      <w:tr>
-        <w:tc>
-          <w:tcPr>
-            <w:tcW w:w="2547" w:type="dxa"/>
-          </w:tcPr>
-          <w:p>
-            <w:pPr>
-              <w:spacing w:line="276" w:lineRule="auto"/>
-              <w:rPr>
-                <w:rFonts w:ascii="Arial" w:hAnsi="Arial" w:cs="Arial"/>
-                <w:sz w:val="24"/>
-                <w:szCs w:val="24"/>
-              </w:rPr>
-            </w:pPr>
-            <w:r>
-              <w:rPr>
-                <w:rFonts w:ascii="Arial" w:hAnsi="Arial" w:cs="Arial"/>
-                <w:sz w:val="24"/>
-                <w:szCs w:val="24"/>
-              </w:rPr>
-              <w:t>Trabajo en equipo</w:t>
-            </w:r>
-          </w:p>
-        </w:tc>
-        <w:tc>
-          <w:tcPr>
-            <w:tcW w:w="5528" w:type="dxa"/>
+              <w:t>Capacidad de colaboración y apoyo dentro del Sprint</w:t>
+            </w:r>
+          </w:p>
+        </w:tc>
+        <w:tc>
+          <w:tcPr>
+            <w:tcW w:w="1319" w:type="dxa"/>
             <w:tcBorders>
               <w:top w:val="single" w:sz="4" w:space="0" w:color="000000"/>
               <w:left w:val="single" w:sz="4" w:space="0" w:color="000000"/>
@@ -20573,6 +20921,7 @@
           <w:p>
             <w:pPr>
               <w:spacing w:line="276" w:lineRule="auto"/>
+              <w:jc w:val="center"/>
               <w:rPr>
                 <w:rFonts w:ascii="Arial" w:hAnsi="Arial" w:cs="Arial"/>
                 <w:sz w:val="24"/>
@@ -20587,13 +20936,38 @@
                 <w:szCs w:val="24"/>
                 <w:lang w:val="es-ES"/>
               </w:rPr>
-              <w:t>Capacidad de colaboración y apoyo dentro del Sprint</w:t>
-            </w:r>
-          </w:p>
-        </w:tc>
-        <w:tc>
-          <w:tcPr>
-            <w:tcW w:w="1319" w:type="dxa"/>
+              <w:t>20 pts.</w:t>
+            </w:r>
+          </w:p>
+        </w:tc>
+      </w:tr>
+      <w:tr>
+        <w:tc>
+          <w:tcPr>
+            <w:tcW w:w="2547" w:type="dxa"/>
+          </w:tcPr>
+          <w:p>
+            <w:pPr>
+              <w:spacing w:line="276" w:lineRule="auto"/>
+              <w:rPr>
+                <w:rFonts w:ascii="Arial" w:hAnsi="Arial" w:cs="Arial"/>
+                <w:sz w:val="24"/>
+                <w:szCs w:val="24"/>
+              </w:rPr>
+            </w:pPr>
+            <w:r>
+              <w:rPr>
+                <w:rFonts w:ascii="Arial" w:hAnsi="Arial" w:cs="Arial"/>
+                <w:sz w:val="24"/>
+                <w:szCs w:val="24"/>
+              </w:rPr>
+              <w:t>Resolución de problemas</w:t>
+            </w:r>
+          </w:p>
+        </w:tc>
+        <w:tc>
+          <w:tcPr>
+            <w:tcW w:w="5528" w:type="dxa"/>
             <w:tcBorders>
               <w:top w:val="single" w:sz="4" w:space="0" w:color="000000"/>
               <w:left w:val="single" w:sz="4" w:space="0" w:color="000000"/>
@@ -20604,7 +20978,6 @@
           <w:p>
             <w:pPr>
               <w:spacing w:line="276" w:lineRule="auto"/>
-              <w:jc w:val="center"/>
               <w:rPr>
                 <w:rFonts w:ascii="Arial" w:hAnsi="Arial" w:cs="Arial"/>
                 <w:sz w:val="24"/>
@@ -20619,47 +20992,13 @@
                 <w:szCs w:val="24"/>
                 <w:lang w:val="es-ES"/>
               </w:rPr>
-              <w:t xml:space="preserve">20 </w:t>
-            </w:r>
-            <w:r>
-              <w:rPr>
-                <w:rFonts w:ascii="Arial" w:hAnsi="Arial" w:cs="Arial"/>
-                <w:sz w:val="24"/>
-                <w:szCs w:val="24"/>
-                <w:lang w:val="es-ES"/>
-              </w:rPr>
-              <w:t>pts.</w:t>
-            </w:r>
-          </w:p>
-        </w:tc>
-      </w:tr>
-      <w:tr>
-        <w:tc>
-          <w:tcPr>
-            <w:tcW w:w="2547" w:type="dxa"/>
-          </w:tcPr>
-          <w:p>
-            <w:pPr>
-              <w:spacing w:line="276" w:lineRule="auto"/>
-              <w:rPr>
-                <w:rFonts w:ascii="Arial" w:hAnsi="Arial" w:cs="Arial"/>
-                <w:sz w:val="24"/>
-                <w:szCs w:val="24"/>
-              </w:rPr>
-            </w:pPr>
-            <w:r>
-              <w:rPr>
-                <w:rFonts w:ascii="Arial" w:hAnsi="Arial" w:cs="Arial"/>
-                <w:sz w:val="24"/>
-                <w:szCs w:val="24"/>
-              </w:rPr>
-              <w:t>Resolución de problemas</w:t>
-            </w:r>
-          </w:p>
-        </w:tc>
-        <w:tc>
-          <w:tcPr>
-            <w:tcW w:w="5528" w:type="dxa"/>
+              <w:t>Capacidad analítica y solución de incidencias técnicas</w:t>
+            </w:r>
+          </w:p>
+        </w:tc>
+        <w:tc>
+          <w:tcPr>
+            <w:tcW w:w="1319" w:type="dxa"/>
             <w:tcBorders>
               <w:top w:val="single" w:sz="4" w:space="0" w:color="000000"/>
               <w:left w:val="single" w:sz="4" w:space="0" w:color="000000"/>
@@ -20670,6 +21009,7 @@
           <w:p>
             <w:pPr>
               <w:spacing w:line="276" w:lineRule="auto"/>
+              <w:jc w:val="center"/>
               <w:rPr>
                 <w:rFonts w:ascii="Arial" w:hAnsi="Arial" w:cs="Arial"/>
                 <w:sz w:val="24"/>
@@ -20684,13 +21024,38 @@
                 <w:szCs w:val="24"/>
                 <w:lang w:val="es-ES"/>
               </w:rPr>
-              <w:t>Capacidad analítica y solución de incidencias técnicas</w:t>
-            </w:r>
-          </w:p>
-        </w:tc>
-        <w:tc>
-          <w:tcPr>
-            <w:tcW w:w="1319" w:type="dxa"/>
+              <w:t>15 pts.</w:t>
+            </w:r>
+          </w:p>
+        </w:tc>
+      </w:tr>
+      <w:tr>
+        <w:tc>
+          <w:tcPr>
+            <w:tcW w:w="2547" w:type="dxa"/>
+          </w:tcPr>
+          <w:p>
+            <w:pPr>
+              <w:spacing w:line="276" w:lineRule="auto"/>
+              <w:rPr>
+                <w:rFonts w:ascii="Arial" w:hAnsi="Arial" w:cs="Arial"/>
+                <w:sz w:val="24"/>
+                <w:szCs w:val="24"/>
+              </w:rPr>
+            </w:pPr>
+            <w:r>
+              <w:rPr>
+                <w:rFonts w:ascii="Arial" w:hAnsi="Arial" w:cs="Arial"/>
+                <w:sz w:val="24"/>
+                <w:szCs w:val="24"/>
+              </w:rPr>
+              <w:t>Conocimiento técnico</w:t>
+            </w:r>
+          </w:p>
+        </w:tc>
+        <w:tc>
+          <w:tcPr>
+            <w:tcW w:w="5528" w:type="dxa"/>
             <w:tcBorders>
               <w:top w:val="single" w:sz="4" w:space="0" w:color="000000"/>
               <w:left w:val="single" w:sz="4" w:space="0" w:color="000000"/>
@@ -20701,7 +21066,6 @@
           <w:p>
             <w:pPr>
               <w:spacing w:line="276" w:lineRule="auto"/>
-              <w:jc w:val="center"/>
               <w:rPr>
                 <w:rFonts w:ascii="Arial" w:hAnsi="Arial" w:cs="Arial"/>
                 <w:sz w:val="24"/>
@@ -20716,47 +21080,13 @@
                 <w:szCs w:val="24"/>
                 <w:lang w:val="es-ES"/>
               </w:rPr>
-              <w:t xml:space="preserve">15 </w:t>
-            </w:r>
-            <w:r>
-              <w:rPr>
-                <w:rFonts w:ascii="Arial" w:hAnsi="Arial" w:cs="Arial"/>
-                <w:sz w:val="24"/>
-                <w:szCs w:val="24"/>
-                <w:lang w:val="es-ES"/>
-              </w:rPr>
-              <w:t>pts.</w:t>
-            </w:r>
-          </w:p>
-        </w:tc>
-      </w:tr>
-      <w:tr>
-        <w:tc>
-          <w:tcPr>
-            <w:tcW w:w="2547" w:type="dxa"/>
-          </w:tcPr>
-          <w:p>
-            <w:pPr>
-              <w:spacing w:line="276" w:lineRule="auto"/>
-              <w:rPr>
-                <w:rFonts w:ascii="Arial" w:hAnsi="Arial" w:cs="Arial"/>
-                <w:sz w:val="24"/>
-                <w:szCs w:val="24"/>
-              </w:rPr>
-            </w:pPr>
-            <w:r>
-              <w:rPr>
-                <w:rFonts w:ascii="Arial" w:hAnsi="Arial" w:cs="Arial"/>
-                <w:sz w:val="24"/>
-                <w:szCs w:val="24"/>
-              </w:rPr>
-              <w:t>Conocimiento técnico</w:t>
-            </w:r>
-          </w:p>
-        </w:tc>
-        <w:tc>
-          <w:tcPr>
-            <w:tcW w:w="5528" w:type="dxa"/>
+              <w:t>Manejo de herramientas, bases de datos y arquitectura</w:t>
+            </w:r>
+          </w:p>
+        </w:tc>
+        <w:tc>
+          <w:tcPr>
+            <w:tcW w:w="1319" w:type="dxa"/>
             <w:tcBorders>
               <w:top w:val="single" w:sz="4" w:space="0" w:color="000000"/>
               <w:left w:val="single" w:sz="4" w:space="0" w:color="000000"/>
@@ -20767,6 +21097,7 @@
           <w:p>
             <w:pPr>
               <w:spacing w:line="276" w:lineRule="auto"/>
+              <w:jc w:val="center"/>
               <w:rPr>
                 <w:rFonts w:ascii="Arial" w:hAnsi="Arial" w:cs="Arial"/>
                 <w:sz w:val="24"/>
@@ -20781,13 +21112,38 @@
                 <w:szCs w:val="24"/>
                 <w:lang w:val="es-ES"/>
               </w:rPr>
-              <w:t>Manejo de herramientas, bases de datos y arquitectura</w:t>
-            </w:r>
-          </w:p>
-        </w:tc>
-        <w:tc>
-          <w:tcPr>
-            <w:tcW w:w="1319" w:type="dxa"/>
+              <w:t>20 pts.</w:t>
+            </w:r>
+          </w:p>
+        </w:tc>
+      </w:tr>
+      <w:tr>
+        <w:tc>
+          <w:tcPr>
+            <w:tcW w:w="2547" w:type="dxa"/>
+          </w:tcPr>
+          <w:p>
+            <w:pPr>
+              <w:spacing w:line="276" w:lineRule="auto"/>
+              <w:rPr>
+                <w:rFonts w:ascii="Arial" w:hAnsi="Arial" w:cs="Arial"/>
+                <w:sz w:val="24"/>
+                <w:szCs w:val="24"/>
+              </w:rPr>
+            </w:pPr>
+            <w:r>
+              <w:rPr>
+                <w:rFonts w:ascii="Arial" w:hAnsi="Arial" w:cs="Arial"/>
+                <w:sz w:val="24"/>
+                <w:szCs w:val="24"/>
+              </w:rPr>
+              <w:t>Adaptabilidad</w:t>
+            </w:r>
+          </w:p>
+        </w:tc>
+        <w:tc>
+          <w:tcPr>
+            <w:tcW w:w="5528" w:type="dxa"/>
             <w:tcBorders>
               <w:top w:val="single" w:sz="4" w:space="0" w:color="000000"/>
               <w:left w:val="single" w:sz="4" w:space="0" w:color="000000"/>
@@ -20798,7 +21154,6 @@
           <w:p>
             <w:pPr>
               <w:spacing w:line="276" w:lineRule="auto"/>
-              <w:jc w:val="center"/>
               <w:rPr>
                 <w:rFonts w:ascii="Arial" w:hAnsi="Arial" w:cs="Arial"/>
                 <w:sz w:val="24"/>
@@ -20813,47 +21168,13 @@
                 <w:szCs w:val="24"/>
                 <w:lang w:val="es-ES"/>
               </w:rPr>
-              <w:t xml:space="preserve">20 </w:t>
-            </w:r>
-            <w:r>
-              <w:rPr>
-                <w:rFonts w:ascii="Arial" w:hAnsi="Arial" w:cs="Arial"/>
-                <w:sz w:val="24"/>
-                <w:szCs w:val="24"/>
-                <w:lang w:val="es-ES"/>
-              </w:rPr>
-              <w:t>pts.</w:t>
-            </w:r>
-          </w:p>
-        </w:tc>
-      </w:tr>
-      <w:tr>
-        <w:tc>
-          <w:tcPr>
-            <w:tcW w:w="2547" w:type="dxa"/>
-          </w:tcPr>
-          <w:p>
-            <w:pPr>
-              <w:spacing w:line="276" w:lineRule="auto"/>
-              <w:rPr>
-                <w:rFonts w:ascii="Arial" w:hAnsi="Arial" w:cs="Arial"/>
-                <w:sz w:val="24"/>
-                <w:szCs w:val="24"/>
-              </w:rPr>
-            </w:pPr>
-            <w:r>
-              <w:rPr>
-                <w:rFonts w:ascii="Arial" w:hAnsi="Arial" w:cs="Arial"/>
-                <w:sz w:val="24"/>
-                <w:szCs w:val="24"/>
-              </w:rPr>
-              <w:t>Adaptabilidad</w:t>
-            </w:r>
-          </w:p>
-        </w:tc>
-        <w:tc>
-          <w:tcPr>
-            <w:tcW w:w="5528" w:type="dxa"/>
+              <w:t>Capacidad para ajustarse a cambios y nuevas tareas</w:t>
+            </w:r>
+          </w:p>
+        </w:tc>
+        <w:tc>
+          <w:tcPr>
+            <w:tcW w:w="1319" w:type="dxa"/>
             <w:tcBorders>
               <w:top w:val="single" w:sz="4" w:space="0" w:color="000000"/>
               <w:left w:val="single" w:sz="4" w:space="0" w:color="000000"/>
@@ -20864,6 +21185,7 @@
           <w:p>
             <w:pPr>
               <w:spacing w:line="276" w:lineRule="auto"/>
+              <w:jc w:val="center"/>
               <w:rPr>
                 <w:rFonts w:ascii="Arial" w:hAnsi="Arial" w:cs="Arial"/>
                 <w:sz w:val="24"/>
@@ -20878,13 +21200,38 @@
                 <w:szCs w:val="24"/>
                 <w:lang w:val="es-ES"/>
               </w:rPr>
-              <w:t>Capacidad para ajustarse a cambios y nuevas tareas</w:t>
-            </w:r>
-          </w:p>
-        </w:tc>
-        <w:tc>
-          <w:tcPr>
-            <w:tcW w:w="1319" w:type="dxa"/>
+              <w:t>15 pts.</w:t>
+            </w:r>
+          </w:p>
+        </w:tc>
+      </w:tr>
+      <w:tr>
+        <w:tc>
+          <w:tcPr>
+            <w:tcW w:w="2547" w:type="dxa"/>
+          </w:tcPr>
+          <w:p>
+            <w:pPr>
+              <w:spacing w:line="276" w:lineRule="auto"/>
+              <w:rPr>
+                <w:rFonts w:ascii="Arial" w:hAnsi="Arial" w:cs="Arial"/>
+                <w:sz w:val="24"/>
+                <w:szCs w:val="24"/>
+              </w:rPr>
+            </w:pPr>
+            <w:r>
+              <w:rPr>
+                <w:rFonts w:ascii="Arial" w:hAnsi="Arial" w:cs="Arial"/>
+                <w:sz w:val="24"/>
+                <w:szCs w:val="24"/>
+              </w:rPr>
+              <w:t>Compromiso y responsabilidad</w:t>
+            </w:r>
+          </w:p>
+        </w:tc>
+        <w:tc>
+          <w:tcPr>
+            <w:tcW w:w="5528" w:type="dxa"/>
             <w:tcBorders>
               <w:top w:val="single" w:sz="4" w:space="0" w:color="000000"/>
               <w:left w:val="single" w:sz="4" w:space="0" w:color="000000"/>
@@ -20895,7 +21242,6 @@
           <w:p>
             <w:pPr>
               <w:spacing w:line="276" w:lineRule="auto"/>
-              <w:jc w:val="center"/>
               <w:rPr>
                 <w:rFonts w:ascii="Arial" w:hAnsi="Arial" w:cs="Arial"/>
                 <w:sz w:val="24"/>
@@ -20910,47 +21256,13 @@
                 <w:szCs w:val="24"/>
                 <w:lang w:val="es-ES"/>
               </w:rPr>
-              <w:t xml:space="preserve">15 </w:t>
-            </w:r>
-            <w:r>
-              <w:rPr>
-                <w:rFonts w:ascii="Arial" w:hAnsi="Arial" w:cs="Arial"/>
-                <w:sz w:val="24"/>
-                <w:szCs w:val="24"/>
-                <w:lang w:val="es-ES"/>
-              </w:rPr>
-              <w:t>pts.</w:t>
-            </w:r>
-          </w:p>
-        </w:tc>
-      </w:tr>
-      <w:tr>
-        <w:tc>
-          <w:tcPr>
-            <w:tcW w:w="2547" w:type="dxa"/>
-          </w:tcPr>
-          <w:p>
-            <w:pPr>
-              <w:spacing w:line="276" w:lineRule="auto"/>
-              <w:rPr>
-                <w:rFonts w:ascii="Arial" w:hAnsi="Arial" w:cs="Arial"/>
-                <w:sz w:val="24"/>
-                <w:szCs w:val="24"/>
-              </w:rPr>
-            </w:pPr>
-            <w:r>
-              <w:rPr>
-                <w:rFonts w:ascii="Arial" w:hAnsi="Arial" w:cs="Arial"/>
-                <w:sz w:val="24"/>
-                <w:szCs w:val="24"/>
-              </w:rPr>
-              <w:t>Compromiso y responsabilidad</w:t>
-            </w:r>
-          </w:p>
-        </w:tc>
-        <w:tc>
-          <w:tcPr>
-            <w:tcW w:w="5528" w:type="dxa"/>
+              <w:t>Cumplimiento de actividades y objetivos del Sprint</w:t>
+            </w:r>
+          </w:p>
+        </w:tc>
+        <w:tc>
+          <w:tcPr>
+            <w:tcW w:w="1319" w:type="dxa"/>
             <w:tcBorders>
               <w:top w:val="single" w:sz="4" w:space="0" w:color="000000"/>
               <w:left w:val="single" w:sz="4" w:space="0" w:color="000000"/>
@@ -20961,6 +21273,7 @@
           <w:p>
             <w:pPr>
               <w:spacing w:line="276" w:lineRule="auto"/>
+              <w:jc w:val="center"/>
               <w:rPr>
                 <w:rFonts w:ascii="Arial" w:hAnsi="Arial" w:cs="Arial"/>
                 <w:sz w:val="24"/>
@@ -20975,7 +21288,43 @@
                 <w:szCs w:val="24"/>
                 <w:lang w:val="es-ES"/>
               </w:rPr>
-              <w:t>Cumplimiento de actividades y objetivos del Sprint</w:t>
+              <w:t>10 pts.</w:t>
+            </w:r>
+          </w:p>
+        </w:tc>
+      </w:tr>
+      <w:tr>
+        <w:tc>
+          <w:tcPr>
+            <w:tcW w:w="8075" w:type="dxa"/>
+            <w:gridSpan w:val="2"/>
+            <w:tcBorders>
+              <w:right w:val="single" w:sz="4" w:space="0" w:color="000000"/>
+            </w:tcBorders>
+            <w:shd w:val="clear" w:color="auto" w:fill="D9D9D9" w:themeFill="background1" w:themeFillShade="D9"/>
+          </w:tcPr>
+          <w:p>
+            <w:pPr>
+              <w:spacing w:line="276" w:lineRule="auto"/>
+              <w:rPr>
+                <w:rFonts w:ascii="Arial" w:hAnsi="Arial" w:cs="Arial"/>
+                <w:b/>
+                <w:bCs/>
+                <w:sz w:val="24"/>
+                <w:szCs w:val="24"/>
+                <w:lang w:val="es-ES"/>
+              </w:rPr>
+            </w:pPr>
+            <w:r>
+              <w:rPr>
+                <w:rFonts w:ascii="Arial" w:hAnsi="Arial" w:cs="Arial"/>
+                <w:b/>
+                <w:bCs/>
+                <w:sz w:val="24"/>
+                <w:szCs w:val="24"/>
+                <w:lang w:val="es-ES"/>
+              </w:rPr>
+              <w:t>Puntaje total</w:t>
             </w:r>
           </w:p>
         </w:tc>
@@ -20995,45 +21344,14 @@
               <w:jc w:val="center"/>
               <w:rPr>
                 <w:rFonts w:ascii="Arial" w:hAnsi="Arial" w:cs="Arial"/>
+                <w:b/>
+                <w:bCs/>
                 <w:sz w:val="24"/>
                 <w:szCs w:val="24"/>
                 <w:lang w:val="es-ES"/>
               </w:rPr>
             </w:pPr>
             <w:r>
-              <w:rPr>
-                <w:rFonts w:ascii="Arial" w:hAnsi="Arial" w:cs="Arial"/>
-                <w:sz w:val="24"/>
-                <w:szCs w:val="24"/>
-                <w:lang w:val="es-ES"/>
-              </w:rPr>
-              <w:t xml:space="preserve">10 </w:t>
-            </w:r>
-            <w:r>
-              <w:rPr>
-                <w:rFonts w:ascii="Arial" w:hAnsi="Arial" w:cs="Arial"/>
-                <w:sz w:val="24"/>
-                <w:szCs w:val="24"/>
-                <w:lang w:val="es-ES"/>
-              </w:rPr>
-              <w:t>pts.</w:t>
-            </w:r>
-          </w:p>
-        </w:tc>
-      </w:tr>
-      <w:tr>
-        <w:tc>
-          <w:tcPr>
-            <w:tcW w:w="8075" w:type="dxa"/>
-            <w:gridSpan w:val="2"/>
-            <w:tcBorders>
-              <w:right w:val="single" w:sz="4" w:space="0" w:color="000000"/>
-            </w:tcBorders>
-            <w:shd w:val="clear" w:color="auto" w:fill="D9D9D9" w:themeFill="background1" w:themeFillShade="D9"/>
-          </w:tcPr>
-          <w:p>
-            <w:pPr>
-              <w:spacing w:line="276" w:lineRule="auto"/>
               <w:rPr>
                 <w:rFonts w:ascii="Arial" w:hAnsi="Arial" w:cs="Arial"/>
                 <w:b/>
@@ -21042,64 +21360,7 @@
                 <w:szCs w:val="24"/>
                 <w:lang w:val="es-ES"/>
               </w:rPr>
-            </w:pPr>
-            <w:r>
-              <w:rPr>
-                <w:rFonts w:ascii="Arial" w:hAnsi="Arial" w:cs="Arial"/>
-                <w:b/>
-                <w:bCs/>
-                <w:sz w:val="24"/>
-                <w:szCs w:val="24"/>
-                <w:lang w:val="es-ES"/>
-              </w:rPr>
-              <w:t>Puntaje total</w:t>
-            </w:r>
-          </w:p>
-        </w:tc>
-        <w:tc>
-          <w:tcPr>
-            <w:tcW w:w="1319" w:type="dxa"/>
-            <w:tcBorders>
-              <w:top w:val="single" w:sz="4" w:space="0" w:color="000000"/>
-              <w:left w:val="single" w:sz="4" w:space="0" w:color="000000"/>
-              <w:bottom w:val="single" w:sz="4" w:space="0" w:color="000000"/>
-              <w:right w:val="single" w:sz="4" w:space="0" w:color="000000"/>
-            </w:tcBorders>
-          </w:tcPr>
-          <w:p>
-            <w:pPr>
-              <w:spacing w:line="276" w:lineRule="auto"/>
-              <w:jc w:val="center"/>
-              <w:rPr>
-                <w:rFonts w:ascii="Arial" w:hAnsi="Arial" w:cs="Arial"/>
-                <w:b/>
-                <w:bCs/>
-                <w:sz w:val="24"/>
-                <w:szCs w:val="24"/>
-                <w:lang w:val="es-ES"/>
-              </w:rPr>
-            </w:pPr>
-            <w:r>
-              <w:rPr>
-                <w:rFonts w:ascii="Arial" w:hAnsi="Arial" w:cs="Arial"/>
-                <w:b/>
-                <w:bCs/>
-                <w:sz w:val="24"/>
-                <w:szCs w:val="24"/>
-                <w:lang w:val="es-ES"/>
-              </w:rPr>
-              <w:t xml:space="preserve">100 </w:t>
-            </w:r>
-            <w:r>
-              <w:rPr>
-                <w:rFonts w:ascii="Arial" w:hAnsi="Arial" w:cs="Arial"/>
-                <w:b/>
-                <w:bCs/>
-                <w:sz w:val="24"/>
-                <w:szCs w:val="24"/>
-                <w:lang w:val="es-ES"/>
-              </w:rPr>
-              <w:t>pts.</w:t>
+              <w:t>100 pts.</w:t>
             </w:r>
           </w:p>
         </w:tc>
@@ -21454,6 +21715,7 @@
                 <w:lang w:val="es-MX" w:eastAsia="es-MX"/>
               </w:rPr>
             </w:pPr>
+            <w:proofErr w:type="spellStart"/>
             <w:r>
               <w:rPr>
                 <w:rFonts w:ascii="Arial" w:eastAsia="Times New Roman" w:hAnsi="Arial" w:cs="Arial"/>
@@ -21464,27 +21726,10 @@
                 <w:szCs w:val="24"/>
                 <w:lang w:val="es-MX" w:eastAsia="es-MX"/>
               </w:rPr>
-              <w:t>Nattier Caraballo</w:t>
-            </w:r>
-          </w:p>
-        </w:tc>
-        <w:tc>
-          <w:tcPr>
-            <w:tcW w:w="0" w:type="auto"/>
-            <w:tcBorders>
-              <w:top w:val="single" w:sz="4" w:space="0" w:color="000000"/>
-              <w:left w:val="nil"/>
-              <w:bottom w:val="single" w:sz="4" w:space="0" w:color="000000"/>
-              <w:right w:val="single" w:sz="4" w:space="0" w:color="000000"/>
-            </w:tcBorders>
-            <w:shd w:val="clear" w:color="auto" w:fill="000F2E"/>
-            <w:vAlign w:val="center"/>
-            <w:hideMark/>
-          </w:tcPr>
-          <w:p>
-            <w:pPr>
-              <w:spacing w:after="0" w:line="240" w:lineRule="auto"/>
-              <w:jc w:val="center"/>
+              <w:t>Nattier</w:t>
+            </w:r>
+            <w:proofErr w:type="spellEnd"/>
+            <w:r>
               <w:rPr>
                 <w:rFonts w:ascii="Arial" w:eastAsia="Times New Roman" w:hAnsi="Arial" w:cs="Arial"/>
                 <w:b/>
@@ -21494,8 +21739,27 @@
                 <w:szCs w:val="24"/>
                 <w:lang w:val="es-MX" w:eastAsia="es-MX"/>
               </w:rPr>
-            </w:pPr>
-            <w:r>
+              <w:t xml:space="preserve"> Caraballo</w:t>
+            </w:r>
+          </w:p>
+        </w:tc>
+        <w:tc>
+          <w:tcPr>
+            <w:tcW w:w="0" w:type="auto"/>
+            <w:tcBorders>
+              <w:top w:val="single" w:sz="4" w:space="0" w:color="000000"/>
+              <w:left w:val="nil"/>
+              <w:bottom w:val="single" w:sz="4" w:space="0" w:color="000000"/>
+              <w:right w:val="single" w:sz="4" w:space="0" w:color="000000"/>
+            </w:tcBorders>
+            <w:shd w:val="clear" w:color="auto" w:fill="000F2E"/>
+            <w:vAlign w:val="center"/>
+            <w:hideMark/>
+          </w:tcPr>
+          <w:p>
+            <w:pPr>
+              <w:spacing w:after="0" w:line="240" w:lineRule="auto"/>
+              <w:jc w:val="center"/>
               <w:rPr>
                 <w:rFonts w:ascii="Arial" w:eastAsia="Times New Roman" w:hAnsi="Arial" w:cs="Arial"/>
                 <w:b/>
@@ -21505,7 +21769,32 @@
                 <w:szCs w:val="24"/>
                 <w:lang w:val="es-MX" w:eastAsia="es-MX"/>
               </w:rPr>
-              <w:t>Cindia López</w:t>
+            </w:pPr>
+            <w:proofErr w:type="spellStart"/>
+            <w:r>
+              <w:rPr>
+                <w:rFonts w:ascii="Arial" w:eastAsia="Times New Roman" w:hAnsi="Arial" w:cs="Arial"/>
+                <w:b/>
+                <w:bCs/>
+                <w:color w:val="FFFFFF"/>
+                <w:sz w:val="24"/>
+                <w:szCs w:val="24"/>
+                <w:lang w:val="es-MX" w:eastAsia="es-MX"/>
+              </w:rPr>
+              <w:t>Cindia</w:t>
+            </w:r>
+            <w:proofErr w:type="spellEnd"/>
+            <w:r>
+              <w:rPr>
+                <w:rFonts w:ascii="Arial" w:eastAsia="Times New Roman" w:hAnsi="Arial" w:cs="Arial"/>
+                <w:b/>
+                <w:bCs/>
+                <w:color w:val="FFFFFF"/>
+                <w:sz w:val="24"/>
+                <w:szCs w:val="24"/>
+                <w:lang w:val="es-MX" w:eastAsia="es-MX"/>
+              </w:rPr>
+              <w:t xml:space="preserve"> López</w:t>
             </w:r>
           </w:p>
         </w:tc>
@@ -25921,6 +26210,7 @@
                 <w:lang w:val="es-MX" w:eastAsia="es-MX"/>
               </w:rPr>
             </w:pPr>
+            <w:proofErr w:type="spellStart"/>
             <w:r>
               <w:rPr>
                 <w:rFonts w:ascii="Arial" w:eastAsia="Times New Roman" w:hAnsi="Arial" w:cs="Arial"/>
@@ -25931,7 +26221,20 @@
                 <w:szCs w:val="24"/>
                 <w:lang w:val="es-MX" w:eastAsia="es-MX"/>
               </w:rPr>
-              <w:t xml:space="preserve">Nattier </w:t>
+              <w:t>Nattier</w:t>
+            </w:r>
+            <w:proofErr w:type="spellEnd"/>
+            <w:r>
+              <w:rPr>
+                <w:rFonts w:ascii="Arial" w:eastAsia="Times New Roman" w:hAnsi="Arial" w:cs="Arial"/>
+                <w:b/>
+                <w:bCs/>
+                <w:color w:val="000000"/>
+                <w:sz w:val="24"/>
+                <w:szCs w:val="24"/>
+                <w:lang w:val="es-MX" w:eastAsia="es-MX"/>
+              </w:rPr>
+              <w:t xml:space="preserve"> </w:t>
             </w:r>
             <w:r>
               <w:rPr>
@@ -26601,6 +26904,7 @@
                 <w:lang w:val="es-MX" w:eastAsia="es-MX"/>
               </w:rPr>
             </w:pPr>
+            <w:proofErr w:type="spellStart"/>
             <w:r>
               <w:rPr>
                 <w:rFonts w:ascii="Arial" w:eastAsia="Times New Roman" w:hAnsi="Arial" w:cs="Arial"/>
@@ -26611,7 +26915,20 @@
                 <w:szCs w:val="24"/>
                 <w:lang w:val="es-MX" w:eastAsia="es-MX"/>
               </w:rPr>
-              <w:t xml:space="preserve">Cindia </w:t>
+              <w:t>Cindia</w:t>
+            </w:r>
+            <w:proofErr w:type="spellEnd"/>
+            <w:r>
+              <w:rPr>
+                <w:rFonts w:ascii="Arial" w:eastAsia="Times New Roman" w:hAnsi="Arial" w:cs="Arial"/>
+                <w:b/>
+                <w:bCs/>
+                <w:color w:val="000000"/>
+                <w:sz w:val="24"/>
+                <w:szCs w:val="24"/>
+                <w:lang w:val="es-MX" w:eastAsia="es-MX"/>
+              </w:rPr>
+              <w:t xml:space="preserve"> </w:t>
             </w:r>
             <w:r>
               <w:rPr>
@@ -30647,6 +30964,7 @@
                 <w:lang w:val="es-MX" w:eastAsia="es-MX"/>
               </w:rPr>
             </w:pPr>
+            <w:proofErr w:type="spellStart"/>
             <w:r>
               <w:rPr>
                 <w:rFonts w:ascii="Arial" w:eastAsia="Times New Roman" w:hAnsi="Arial" w:cs="Arial"/>
@@ -30657,15 +30975,27 @@
               </w:rPr>
               <w:t>Product</w:t>
             </w:r>
-            <w:r>
-              <w:rPr>
-                <w:rFonts w:ascii="Arial" w:eastAsia="Times New Roman" w:hAnsi="Arial" w:cs="Arial"/>
-                <w:color w:val="000000"/>
-                <w:sz w:val="24"/>
-                <w:szCs w:val="24"/>
-                <w:lang w:val="es-MX" w:eastAsia="es-MX"/>
-              </w:rPr>
-              <w:t xml:space="preserve"> O</w:t>
+            <w:proofErr w:type="spellEnd"/>
+            <w:r>
+              <w:rPr>
+                <w:rFonts w:ascii="Arial" w:eastAsia="Times New Roman" w:hAnsi="Arial" w:cs="Arial"/>
+                <w:color w:val="000000"/>
+                <w:sz w:val="24"/>
+                <w:szCs w:val="24"/>
+                <w:lang w:val="es-MX" w:eastAsia="es-MX"/>
+              </w:rPr>
+              <w:t xml:space="preserve"> </w:t>
+            </w:r>
+            <w:proofErr w:type="spellStart"/>
+            <w:r>
+              <w:rPr>
+                <w:rFonts w:ascii="Arial" w:eastAsia="Times New Roman" w:hAnsi="Arial" w:cs="Arial"/>
+                <w:color w:val="000000"/>
+                <w:sz w:val="24"/>
+                <w:szCs w:val="24"/>
+                <w:lang w:val="es-MX" w:eastAsia="es-MX"/>
+              </w:rPr>
+              <w:t>O</w:t>
             </w:r>
             <w:r>
               <w:rPr>
@@ -30677,6 +31007,7 @@
               </w:rPr>
               <w:t>wner</w:t>
             </w:r>
+            <w:proofErr w:type="spellEnd"/>
           </w:p>
         </w:tc>
         <w:tc>

</xml_diff>